<commit_message>
Rewrite the 桌面控制 bullet in the 详细版, and say where the coordinates come from
The bullet had lost its head: all that was left in the list was the tail clause
("打开开关即表示你同意它直接动手…"), so the 详细版 described desktop control nowhere
except the lineage table and the tool table's screen row.

Rewritten from the user's own write-up of the capability (VC小记② chapter 10 §⑤):
the model answers "which one" while the program supplies the rectangle (a11y rect,
OCR text box, or the program's own thresholded boxes), the tool face has no x/y at
all, typing exists in one way only (逐字, 0.15s a character, stop works mid-run),
and desktop control stays a supplement — file CRUD goes through the shell, opening a
window goes through the application's own entry point, and only self-drawn surfaces
with no programmatic path are driven by pixels.

The Typer row of the lineage table said "默认仍是粘贴" — true when it was written,
false since the 2026-09-14 ruling deleted the paste route. Corrected there.
</commit_message>
<xml_diff>
--- a/docs/README-详细版.docx
+++ b/docs/README-详细版.docx
@@ -1733,7 +1733,7 @@
           </w:tcPr>
           <w:p>
             <w:r>
-              <w:t>直系。type_text() 的骨架就是它——一个字符一次注入、char_delay、末字之后不停顿、换行发 Enter、Tab 发 Tab、剪贴板全程不碰。Fungi 换了实现（自建 SendInput + KEYEVENTF_UNICODE，绕开输入法与键盘布局，中文不必切输入法），并加回读验证；默认仍是粘贴，只有 style="type" 才走逐字。</w:t>
+              <w:t>直系。type_text() 的骨架就是它——一个字符一次注入、char_delay、末字之后不停顿、换行发 Enter、Tab 发 Tab、剪贴板全程不碰。Fungi 换了实现（自建 SendInput + KEYEVENTF_UNICODE，绕开输入法与键盘布局，中文不必切输入法），并加回读验证。这里还留着 2026-09-14 的一次改口：默认粘贴那条路整块删净——输入只有逐字一种方式（不留半死的开关），节奏定在 0.15 秒一个字，因为「快得像粘贴」正是逐字要消灭的东西。</w:t>
             </w:r>
           </w:p>
         </w:tc>
@@ -3125,39 +3125,42 @@
         <w:rPr>
           <w:b/>
         </w:rPr>
-        <w:t>打开开关即表示你同意它直接动手；关掉开关立刻收回，并释放所有按着的键；</w:t>
-      </w:r>
-      <w:proofErr w:type="spellEnd"/>
-      <w:proofErr w:type="spellStart"/>
-      <w:proofErr w:type="spellEnd"/>
-      <w:proofErr w:type="spellStart"/>
-      <w:proofErr w:type="spellEnd"/>
-      <w:proofErr w:type="spellStart"/>
-      <w:proofErr w:type="spellEnd"/>
-      <w:proofErr w:type="spellStart"/>
-      <w:proofErr w:type="spellEnd"/>
-      <w:proofErr w:type="spellStart"/>
-      <w:proofErr w:type="spellEnd"/>
-      <w:proofErr w:type="spellStart"/>
-      <w:proofErr w:type="spellEnd"/>
-      <w:proofErr w:type="spellStart"/>
-      <w:proofErr w:type="spellEnd"/>
-      <w:proofErr w:type="spellStart"/>
-      <w:proofErr w:type="spellEnd"/>
-      <w:proofErr w:type="spellStart"/>
-      <w:proofErr w:type="spellEnd"/>
-      <w:proofErr w:type="spellStart"/>
-      <w:proofErr w:type="spellEnd"/>
-      <w:proofErr w:type="spellStart"/>
-      <w:proofErr w:type="spellEnd"/>
-      <w:proofErr w:type="spellStart"/>
-      <w:proofErr w:type="spellEnd"/>
-      <w:proofErr w:type="spellStart"/>
-      <w:proofErr w:type="spellEnd"/>
-      <w:proofErr w:type="spellStart"/>
-      <w:proofErr w:type="spellEnd"/>
-      <w:proofErr w:type="spellStart"/>
-      <w:proofErr w:type="spellEnd"/>
+        <w:t>桌面控制（screen，实验性、默认关）</w:t>
+      </w:r>
+      <w:proofErr w:type="spellEnd"/>
+      <w:proofErr w:type="spellStart"/>
+      <w:proofErr w:type="spellEnd"/>
+      <w:proofErr w:type="spellStart"/>
+      <w:proofErr w:type="spellEnd"/>
+      <w:proofErr w:type="spellStart"/>
+      <w:proofErr w:type="spellEnd"/>
+      <w:proofErr w:type="spellStart"/>
+      <w:proofErr w:type="spellEnd"/>
+      <w:proofErr w:type="spellStart"/>
+      <w:proofErr w:type="spellEnd"/>
+      <w:proofErr w:type="spellStart"/>
+      <w:proofErr w:type="spellEnd"/>
+      <w:proofErr w:type="spellStart"/>
+      <w:proofErr w:type="spellEnd"/>
+      <w:proofErr w:type="spellStart"/>
+      <w:proofErr w:type="spellEnd"/>
+      <w:proofErr w:type="spellStart"/>
+      <w:proofErr w:type="spellEnd"/>
+      <w:proofErr w:type="spellStart"/>
+      <w:proofErr w:type="spellEnd"/>
+      <w:proofErr w:type="spellStart"/>
+      <w:proofErr w:type="spellEnd"/>
+      <w:proofErr w:type="spellStart"/>
+      <w:proofErr w:type="spellEnd"/>
+      <w:proofErr w:type="spellStart"/>
+      <w:proofErr w:type="spellEnd"/>
+      <w:proofErr w:type="spellStart"/>
+      <w:proofErr w:type="spellEnd"/>
+      <w:proofErr w:type="spellStart"/>
+      <w:proofErr w:type="spellEnd"/>
+      <w:r>
+        <w:t>：设置页打开开关，本机 Agent 才多出这件工具——看这台电脑的屏幕、点控件、往里打字、按键、把滚动区外的控件滚进可视区。它从不猜坐标：工具面里根本没有 x/y 参数，模型只回答「点哪一个」（候选编号或控件名），坐标由程序自己取——UI Automation 拿到的控件矩形最准，自绘界面没有 a11y 才退到 OCR 的文本框，再不行由程序在截图里切框编号、把编号画回图上让它挑。这条路的由来是：我原以为 VLM 定位不了坐标，Computer Use 只能靠 GUI 妥协；后来想通了——让坐标自己暴露出来，OCR 认字、程序切框，VLM 只做它真正擅长的语义判断。打字只有一种方式：逐字，一个字符一次注入（绕开输入法与键盘布局），0.15 秒一个字，打字过程中随时能停；粘贴那条路已经删干净，不留半死的开关。桌控只是补充，不是替代——文件的增删改一律走 shell（名字就是名字，不用先把画面解析成矩形），打开窗口走应用自己的门口（任务栏按钮、托盘图标、桌面图标），只有微信、QQ 这类没有程序路径的自绘界面才不得不动像素。每步动作后回读程序侧真值校验，连续三次对不上就改为问你；打开开关即表示你同意它直接动手，关掉立刻收回并松开所有按着的键；需要管理员权限的窗口它够不到（Windows 拦着）。</w:t>
+      </w:r>
     </w:p>
     <w:p>
       <w:pPr>

</xml_diff>

<commit_message>
gate: the local script checks formatting instead of rewriting it
</commit_message>
<xml_diff>
--- a/docs/README-详细版.docx
+++ b/docs/README-详细版.docx
@@ -3121,6 +3121,52 @@
         <w:pStyle w:val="a0"/>
       </w:pPr>
       <w:proofErr w:type="spellStart"/>
+      <w:proofErr w:type="spellEnd"/>
+      <w:proofErr w:type="spellStart"/>
+      <w:proofErr w:type="spellEnd"/>
+      <w:proofErr w:type="spellStart"/>
+      <w:proofErr w:type="spellEnd"/>
+      <w:proofErr w:type="spellStart"/>
+      <w:proofErr w:type="spellEnd"/>
+      <w:proofErr w:type="spellStart"/>
+      <w:proofErr w:type="spellEnd"/>
+      <w:proofErr w:type="spellStart"/>
+      <w:proofErr w:type="spellEnd"/>
+      <w:proofErr w:type="spellStart"/>
+      <w:proofErr w:type="spellEnd"/>
+      <w:proofErr w:type="spellStart"/>
+      <w:proofErr w:type="spellEnd"/>
+      <w:proofErr w:type="spellStart"/>
+      <w:proofErr w:type="spellEnd"/>
+      <w:proofErr w:type="spellStart"/>
+      <w:proofErr w:type="spellEnd"/>
+      <w:proofErr w:type="spellStart"/>
+      <w:proofErr w:type="spellEnd"/>
+      <w:proofErr w:type="spellStart"/>
+      <w:proofErr w:type="spellEnd"/>
+      <w:proofErr w:type="spellStart"/>
+      <w:proofErr w:type="spellEnd"/>
+      <w:proofErr w:type="spellStart"/>
+      <w:proofErr w:type="spellEnd"/>
+      <w:proofErr w:type="spellStart"/>
+      <w:proofErr w:type="spellEnd"/>
+      <w:proofErr w:type="spellStart"/>
+      <w:proofErr w:type="spellEnd"/>
+      <w:r>
+        <w:rPr>
+          <w:b/>
+        </w:rPr>
+        <w:t>GhostWorld 角色控制</w:t>
+      </w:r>
+      <w:r>
+        <w:t>（拓展、默认关）：把本机的 GhostWorld（一个独立的第一人称小世界）接成一个角色——Agent 多出一件 ghostworld 工具：pos/look 问路环视、goto/move 走位、say 用自己的嘴说话、pickup 拾取。玩家在游戏里说话会把它叫醒；若它正在想事情（走路、连着几个工具调用），这句话会当场把那一轮打断再重新开始（与 WebUI 的停止同一套机制），角色不会装聋。snapshot 会把它第一人称看到的画面——天空、地面、建筑、视野里的人——渲染成一张图直接附给它的视觉模型，坐标和清单不够用时靠这个确认。前置：游戏在本机运行，config.json 的 ghostworld_dir 指向游戏目录（已 pip 安装的可留空）。</w:t>
+      </w:r>
+    </w:p>
+    <w:p>
+      <w:pPr>
+        <w:pStyle w:val="a0"/>
+      </w:pPr>
+      <w:proofErr w:type="spellStart"/>
       <w:r>
         <w:rPr>
           <w:b/>
@@ -7549,7 +7595,7 @@
           <w:rFonts w:ascii="Consolas" w:hAnsi="Consolas"/>
           <w:sz w:val="18"/>
         </w:rPr>
-        <w:t>526 passed</w:t>
+        <w:t>587 passed</w:t>
       </w:r>
       <w:r>
         <w:rPr>

</xml_diff>